<commit_message>
Synchronize final Word report wording
</commit_message>
<xml_diff>
--- a/reports/final-report.docx
+++ b/reports/final-report.docx
@@ -127,7 +127,7 @@
         <w:jc w:val="both"/>
       </w:pPr>
       <w:r>
-        <w:t>Long-lived tool-using agents can retain stale knowledge after tool names, parameters, descriptions, or usage rules change. This project evaluates three harness strategies on MCPEvol-Bench while keeping the base model, decoding settings, tasks, environment endpoints, and Judge protocol fixed: No Update, Full Rewrite, and a Selective Patch method that changes only knowledge linked to detected tool changes. We run a fixed 30-task subset across Early, Middle, and Late environments, with three independent runs and five Judge scores per task. The final matrix contains 27 experiment cells, 810 trajectories, and 4,050 successful Judge scores. Full Rewrite achieves the strongest overall result (mean TF 8.75, success 81.5%), while Selective Patch does not show a reliable improvement over No Update. Paired trajectories identify one candidate under-update failure in Selective Patch and a Full Rewrite efficiency regression that remains above the success threshold. Because the formal matrix contains no natural over-update failure, a separate controlled retention-task ablation demonstrates how an over-broad output-protocol rewrite can break task termination. The results show that selective adaptation can preserve unaffected behavior, but its benefit depends on complete change detection.</w:t>
+        <w:t>Long-lived tool-using agents can retain stale knowledge after tool names, parameters, descriptions, or usage rules change. This project evaluates three harness strategies on MCPEvol-Bench while keeping the base model, decoding settings, tasks, environment endpoints, and Judge protocol fixed: No Update, Full Rewrite, and a Selective Patch method that changes only knowledge linked to detected tool changes. We run a fixed 30-task subset across Early, Middle, and Late environments, with three independent runs and five Judge scores per task. The final matrix contains 27 experiment cells, 810 trajectories, and 4,050 successful Judge scores. Full Rewrite performed best under this specific protocol and fixed subset (mean TF 8.75, success 81.5%), while Selective Patch does not show a reliable improvement over No Update. Task 2 is a candidate under-update case, and paired trajectories also identify a Full Rewrite efficiency regression that remains above the success threshold. No natural over-update case was observed in the formal matrix. Task 235 is a controlled over-update ablation showing how an over-broad output-protocol rewrite can break task termination. The results show that selective adaptation can preserve unaffected behavior, but its benefit depends on complete change detection.</w:t>
       </w:r>
     </w:p>
     <w:p>
@@ -1250,7 +1250,7 @@
           <w:sz w:val="21"/>
           <w:szCs w:val="21"/>
         </w:rPr>
-        <w:t xml:space="preserve">Full Rewrite is the strongest strategy under the evaluated protocol. Selective Patch has nearly the same overall success rate as No Update and a slightly lower mean TF.</w:t>
+        <w:t>Full Rewrite performed best under this specific protocol and fixed subset. Selective Patch has nearly the same overall success rate as No Update and a slightly lower mean TF.</w:t>
       </w:r>
     </w:p>
     <w:p>
@@ -1783,7 +1783,7 @@
         <w:pStyle w:val="Heading2"/>
       </w:pPr>
       <w:r>
-        <w:t>This is a candidate under-update, not a confirmed changed-contract failure. The exported search_agents description and input schema are identical in Early, Middle, and Late, and the original harness contains generic rules rather than an old keyword contract. The manifest marks whole servers as affected; it does not establish that this particular tool changed. Failures also occur in Early, where Selective Patch adds no updates. The trajectories establish a repeated query-planning difference, but proving under-update requires a verified before/after behavioral change or a controlled corrected patch comparison. That evidence is not available in this submission.</w:t>
+        <w:t>Task 2 is a candidate under-update case, not a confirmed changed-contract failure. The exported search_agents description and input schema are identical in Early, Middle, and Late, and the original harness contains generic rules rather than an old keyword contract. The manifest marks whole servers as affected; it does not establish that this particular tool changed. Failures also occur in Early, where Selective Patch adds no updates. The trajectories establish a repeated query-planning difference, but proving under-update requires a verified before/after behavioral change or a controlled corrected patch comparison. That evidence is not available in this submission.</w:t>
       </w:r>
     </w:p>
     <w:p>
@@ -1906,7 +1906,7 @@
           <w:sz w:val="21"/>
           <w:szCs w:val="21"/>
         </w:rPr>
-        <w:t xml:space="preserve">No natural retention failure in the 27-cell matrix satisfies the strict over-update definition. A supplementary controlled ablation therefore applies an intentionally over-broad rewrite to retention Task 235 in the Middle environment. This ablation is stored outside the three formal strategy result trees and is excluded from every aggregate and confidence interval.</w:t>
+        <w:t>No natural over-update case was observed in the formal matrix. A supplementary controlled ablation therefore applies an intentionally over-broad rewrite to retention Task 235 in the Middle environment. This ablation is stored outside the three formal strategy result trees and is excluded from every aggregate and confidence interval.</w:t>
       </w:r>
     </w:p>
     <w:p>
@@ -1971,7 +1971,7 @@
           <w:sz w:val="21"/>
           <w:szCs w:val="21"/>
         </w:rPr>
-        <w:t xml:space="preserve">), and returns an empty answer. This paired trajectory is a confirmed over-update mechanism: unrelated rewritten knowledge breaks a previously successful retention task.</w:t>
+        <w:t>), and returns an empty answer. This is the controlled over-update ablation result: unrelated rewritten knowledge breaks a previously successful retention task under the deliberately modified harness.</w:t>
       </w:r>
     </w:p>
     <w:p>
@@ -2109,7 +2109,7 @@
         <w:jc w:val="both"/>
       </w:pPr>
       <w:r>
-        <w:t>Full Rewrite performs best in this matrix and directs the model to live schemas. However, Task 260 shows that broad guidance can coexist with a systematic efficiency regression even when the task remains successful. The Task 235 ablation separately demonstrates a causal over-update mechanism: rewriting an unrelated output protocol can break termination despite correct tool calls. Recovery and retention therefore require both current contracts and strict scope control over what the adaptation is allowed to rewrite.</w:t>
+        <w:t>Full Rewrite performed best under this specific protocol and fixed subset and directs the model to live schemas. However, Task 260 shows that broad guidance can coexist with a systematic efficiency regression even when the task remains successful. Task 235 is a controlled over-update ablation: rewriting an unrelated output protocol can break termination despite correct tool calls. Recovery and retention therefore require both current contracts and strict scope control over what the adaptation is allowed to rewrite.</w:t>
       </w:r>
     </w:p>
     <w:p>
@@ -2254,7 +2254,7 @@
         <w:jc w:val="both"/>
       </w:pPr>
       <w:r>
-        <w:t>Under the completed protocol, Full Rewrite provides the strongest recovery and cross-version stability. The current Selective Patch does not reliably improve over No Update; the mechanism behind its Task 2 deficit remains a candidate explanation. Full Rewrite also introduces a measurable retention efficiency regression on Task 260, while the controlled Task 235 ablation shows that an over-broad rewrite can break termination entirely. The central lesson is that selective adaptation needs high semantic coverage, while broad rewriting needs strict scope and output-protocol safeguards.</w:t>
+        <w:t>Full Rewrite performed best under this specific protocol and fixed subset, providing the strongest observed recovery and cross-version stability. The current Selective Patch does not reliably improve over No Update; the mechanism behind its Task 2 deficit remains a candidate explanation. Full Rewrite also introduces a measurable retention efficiency regression on Task 260, while the controlled Task 235 ablation shows that an over-broad rewrite can break termination entirely. The central lesson is that selective adaptation needs high semantic coverage, while broad rewriting needs strict scope and output-protocol safeguards.</w:t>
       </w:r>
     </w:p>
     <w:p>

</xml_diff>